<commit_message>
feat(01-04): add PDF export to legal notices generator
- Import child_process.execSync for LibreOffice shell-out
- Add OUTPUT_PDF_PATH constant alongside OUTPUT_PATH
- After DOCX write, convert to PDF via `soffice --headless --convert-to pdf`
- Generate docs/OpenSpatialDelay_Legal_Notices.pdf (120KB)
- PDF contains MIT, Apache License, CC BY third-party notices
</commit_message>
<xml_diff>
--- a/docs/OpenSpatialDelay_Legal_Notices.docx
+++ b/docs/OpenSpatialDelay_Legal_Notices.docx
@@ -129,7 +129,7 @@
       <w:pPr>
         <w:jc w:val="center"/>
       </w:pPr>
-      <w:hyperlink w:history="1" r:id="rIdw538v_3nchb6btko1etvw">
+      <w:hyperlink w:history="1" r:id="rIda22m-nggecgtn1uzoexxw">
         <w:r>
           <w:rPr>
             <w:rFonts w:ascii="DM Sans" w:cs="DM Sans" w:eastAsia="DM Sans" w:hAnsi="DM Sans"/>
@@ -150,7 +150,7 @@
         </w:rPr>
         <w:t xml:space="preserve">  |  </w:t>
       </w:r>
-      <w:hyperlink w:history="1" r:id="rIdm2seb_h7rgquosfntrpfr">
+      <w:hyperlink w:history="1" r:id="rIdgwfps5wgctwgv4yydf0cx">
         <w:r>
           <w:rPr>
             <w:rFonts w:ascii="DM Sans" w:cs="DM Sans" w:eastAsia="DM Sans" w:hAnsi="DM Sans"/>
@@ -761,7 +761,7 @@
         </w:rPr>
         <w:t xml:space="preserve">Website: </w:t>
       </w:r>
-      <w:hyperlink w:history="1" r:id="rIdxzk6ffj7r2sodvc5wdus8">
+      <w:hyperlink w:history="1" r:id="rIdpodldbcz-lcphfj3g02xh">
         <w:r>
           <w:rPr>
             <w:rFonts w:ascii="DM Sans" w:cs="DM Sans" w:eastAsia="DM Sans" w:hAnsi="DM Sans"/>
@@ -818,7 +818,7 @@
         </w:rPr>
         <w:t xml:space="preserve">Website: </w:t>
       </w:r>
-      <w:hyperlink w:history="1" r:id="rId7fycc5jrzolcultdxa2hp">
+      <w:hyperlink w:history="1" r:id="rIdoueha9gwbhjc2zcomsetf">
         <w:r>
           <w:rPr>
             <w:rFonts w:ascii="DM Sans" w:cs="DM Sans" w:eastAsia="DM Sans" w:hAnsi="DM Sans"/>
@@ -1021,7 +1021,7 @@
         </w:rPr>
         <w:t xml:space="preserve">Website: </w:t>
       </w:r>
-      <w:hyperlink w:history="1" r:id="rId4alegppkznt_1zcepnjre">
+      <w:hyperlink w:history="1" r:id="rIdcp-yqtghz11hwcnv1gemq">
         <w:r>
           <w:rPr>
             <w:rFonts w:ascii="DM Sans" w:cs="DM Sans" w:eastAsia="DM Sans" w:hAnsi="DM Sans"/>
@@ -1388,7 +1388,7 @@
                 <w:sz w:val="18"/>
                 <w:szCs w:val="18"/>
               </w:rPr>
-              <w:t xml:space="preserve">Studio Reference</w:t>
+              <w:t xml:space="preserve">Immersive</w:t>
             </w:r>
           </w:p>
         </w:tc>
@@ -1416,7 +1416,7 @@
                 <w:sz w:val="18"/>
                 <w:szCs w:val="18"/>
               </w:rPr>
-              <w:t xml:space="preserve">MIT KEMAR Large Pinna</w:t>
+              <w:t xml:space="preserve">SADIE II D2 KU100</w:t>
             </w:r>
           </w:p>
         </w:tc>
@@ -1444,7 +1444,7 @@
                 <w:sz w:val="18"/>
                 <w:szCs w:val="18"/>
               </w:rPr>
-              <w:t xml:space="preserve">MIT License</w:t>
+              <w:t xml:space="preserve">Apache License 2.0</w:t>
             </w:r>
           </w:p>
         </w:tc>
@@ -1472,7 +1472,7 @@
                 <w:sz w:val="18"/>
                 <w:szCs w:val="18"/>
               </w:rPr>
-              <w:t xml:space="preserve">MIT Media Lab</w:t>
+              <w:t xml:space="preserve">University of York</w:t>
             </w:r>
           </w:p>
         </w:tc>
@@ -1503,7 +1503,7 @@
                 <w:sz w:val="18"/>
                 <w:szCs w:val="18"/>
               </w:rPr>
-              <w:t xml:space="preserve">Immersive</w:t>
+              <w:t xml:space="preserve">Natural</w:t>
             </w:r>
           </w:p>
         </w:tc>
@@ -1532,7 +1532,7 @@
                 <w:sz w:val="18"/>
                 <w:szCs w:val="18"/>
               </w:rPr>
-              <w:t xml:space="preserve">SADIE II D2 KU100</w:t>
+              <w:t xml:space="preserve">CIPIC Subject 003</w:t>
             </w:r>
           </w:p>
         </w:tc>
@@ -1561,7 +1561,7 @@
                 <w:sz w:val="18"/>
                 <w:szCs w:val="18"/>
               </w:rPr>
-              <w:t xml:space="preserve">Apache License 2.0</w:t>
+              <w:t xml:space="preserve">Public Domain</w:t>
             </w:r>
           </w:p>
         </w:tc>
@@ -1590,7 +1590,7 @@
                 <w:sz w:val="18"/>
                 <w:szCs w:val="18"/>
               </w:rPr>
-              <w:t xml:space="preserve">University of York</w:t>
+              <w:t xml:space="preserve">UC Davis CIPIC Lab</w:t>
             </w:r>
           </w:p>
         </w:tc>
@@ -1620,7 +1620,7 @@
                 <w:sz w:val="18"/>
                 <w:szCs w:val="18"/>
               </w:rPr>
-              <w:t xml:space="preserve">Natural</w:t>
+              <w:t xml:space="preserve">Precise</w:t>
             </w:r>
           </w:p>
         </w:tc>
@@ -1648,7 +1648,7 @@
                 <w:sz w:val="18"/>
                 <w:szCs w:val="18"/>
               </w:rPr>
-              <w:t xml:space="preserve">CIPIC Subject 003</w:t>
+              <w:t xml:space="preserve">HUTUBS PP2</w:t>
             </w:r>
           </w:p>
         </w:tc>
@@ -1676,7 +1676,7 @@
                 <w:sz w:val="18"/>
                 <w:szCs w:val="18"/>
               </w:rPr>
-              <w:t xml:space="preserve">Public Domain</w:t>
+              <w:t xml:space="preserve">CC BY 4.0</w:t>
             </w:r>
           </w:p>
         </w:tc>
@@ -1704,7 +1704,7 @@
                 <w:sz w:val="18"/>
                 <w:szCs w:val="18"/>
               </w:rPr>
-              <w:t xml:space="preserve">UC Davis CIPIC Lab</w:t>
+              <w:t xml:space="preserve">TU Berlin</w:t>
             </w:r>
           </w:p>
         </w:tc>
@@ -1735,7 +1735,7 @@
                 <w:sz w:val="18"/>
                 <w:szCs w:val="18"/>
               </w:rPr>
-              <w:t xml:space="preserve">Precise</w:t>
+              <w:t xml:space="preserve">Spatial</w:t>
             </w:r>
           </w:p>
         </w:tc>
@@ -1764,7 +1764,7 @@
                 <w:sz w:val="18"/>
                 <w:szCs w:val="18"/>
               </w:rPr>
-              <w:t xml:space="preserve">HUTUBS PP2</w:t>
+              <w:t xml:space="preserve">Bernschuetz KU100 2°</w:t>
             </w:r>
           </w:p>
         </w:tc>
@@ -1793,7 +1793,7 @@
                 <w:sz w:val="18"/>
                 <w:szCs w:val="18"/>
               </w:rPr>
-              <w:t xml:space="preserve">CC BY 4.0</w:t>
+              <w:t xml:space="preserve">CC BY 3.0</w:t>
             </w:r>
           </w:p>
         </w:tc>
@@ -1822,7 +1822,7 @@
                 <w:sz w:val="18"/>
                 <w:szCs w:val="18"/>
               </w:rPr>
-              <w:t xml:space="preserve">TU Berlin</w:t>
+              <w:t xml:space="preserve">TH Köln</w:t>
             </w:r>
           </w:p>
         </w:tc>
@@ -1852,7 +1852,7 @@
                 <w:sz w:val="18"/>
                 <w:szCs w:val="18"/>
               </w:rPr>
-              <w:t xml:space="preserve">Spatial</w:t>
+              <w:t xml:space="preserve">Studio Reference</w:t>
             </w:r>
           </w:p>
         </w:tc>
@@ -1880,7 +1880,7 @@
                 <w:sz w:val="18"/>
                 <w:szCs w:val="18"/>
               </w:rPr>
-              <w:t xml:space="preserve">Bernschuetz KU100 2°</w:t>
+              <w:t xml:space="preserve">MIT KEMAR Large Pinna</w:t>
             </w:r>
           </w:p>
         </w:tc>
@@ -1908,7 +1908,7 @@
                 <w:sz w:val="18"/>
                 <w:szCs w:val="18"/>
               </w:rPr>
-              <w:t xml:space="preserve">CC BY 3.0</w:t>
+              <w:t xml:space="preserve">MIT License</w:t>
             </w:r>
           </w:p>
         </w:tc>
@@ -1936,7 +1936,7 @@
                 <w:sz w:val="18"/>
                 <w:szCs w:val="18"/>
               </w:rPr>
-              <w:t xml:space="preserve">TH Köln</w:t>
+              <w:t xml:space="preserve">MIT Media Lab</w:t>
             </w:r>
           </w:p>
         </w:tc>
@@ -2012,7 +2012,7 @@
         </w:rPr>
         <w:t xml:space="preserve">Reference: </w:t>
       </w:r>
-      <w:hyperlink w:history="1" r:id="rIdei6h65jxkm8i-heg3nhhq">
+      <w:hyperlink w:history="1" r:id="rIdrnljtlvyz_vtmzgz55zbj">
         <w:r>
           <w:rPr>
             <w:rFonts w:ascii="DM Sans" w:cs="DM Sans" w:eastAsia="DM Sans" w:hAnsi="DM Sans"/>
@@ -2187,7 +2187,7 @@
         </w:rPr>
         <w:t xml:space="preserve">Reference: Gavin Kearney, Tony Doyle, </w:t>
       </w:r>
-      <w:hyperlink w:history="1" r:id="rIdfy8bwrxwwuz2-bs6zb-a6">
+      <w:hyperlink w:history="1" r:id="rIdka5ugllu0cf_197yvfi0n">
         <w:r>
           <w:rPr>
             <w:rFonts w:ascii="DM Sans" w:cs="DM Sans" w:eastAsia="DM Sans" w:hAnsi="DM Sans"/>
@@ -2410,7 +2410,7 @@
         </w:rPr>
         <w:t xml:space="preserve">Reference: </w:t>
       </w:r>
-      <w:hyperlink w:history="1" r:id="rIdkj5kfzkbpttlt1omsg5c1">
+      <w:hyperlink w:history="1" r:id="rIdcas_qab35moymvlavwwjo">
         <w:r>
           <w:rPr>
             <w:rFonts w:ascii="DM Sans" w:cs="DM Sans" w:eastAsia="DM Sans" w:hAnsi="DM Sans"/>
@@ -2472,7 +2472,7 @@
         </w:rPr>
         <w:t xml:space="preserve">Reference: Fabian Brinkmann, Alexander Lindau, Stefan Weinzierl, et al. </w:t>
       </w:r>
-      <w:hyperlink w:history="1" r:id="rId5gqykvikrsqsp2hpcdx6d">
+      <w:hyperlink w:history="1" r:id="rIdaibz4-zh_tt2vuynflzme">
         <w:r>
           <w:rPr>
             <w:rFonts w:ascii="DM Sans" w:cs="DM Sans" w:eastAsia="DM Sans" w:hAnsi="DM Sans"/>
@@ -2650,7 +2650,7 @@
         </w:rPr>
         <w:t xml:space="preserve">Reference: </w:t>
       </w:r>
-      <w:hyperlink w:history="1" r:id="rId4pviy-8tv6tit6jfzsfy-">
+      <w:hyperlink w:history="1" r:id="rId_denpys4fmpfjeegjuk4q">
         <w:r>
           <w:rPr>
             <w:rFonts w:ascii="DM Sans" w:cs="DM Sans" w:eastAsia="DM Sans" w:hAnsi="DM Sans"/>
@@ -3614,7 +3614,7 @@
         </w:rPr>
         <w:t xml:space="preserve">Roboto is licensed under the Apache License, Version 2.0 by Google LLC. You may obtain a copy of the License at </w:t>
       </w:r>
-      <w:hyperlink w:history="1" r:id="rId1wgduazzf65nhxjkl9lag">
+      <w:hyperlink w:history="1" r:id="rIdfe8jwj6zdsexozczwehpg">
         <w:r>
           <w:rPr>
             <w:rFonts w:ascii="DM Sans" w:cs="DM Sans" w:eastAsia="DM Sans" w:hAnsi="DM Sans"/>
@@ -3674,13 +3674,8 @@
           <w:sz w:val="22"/>
           <w:szCs w:val="22"/>
         </w:rPr>
-        <w:t xml:space="preserve">OpenSpatialDelay is dual-licensed:</w:t>
-      </w:r>
-    </w:p>
-    <w:p>
-      <w:pPr>
-        <w:spacing w:after="160" w:line="300"/>
-      </w:pPr>
+        <w:t xml:space="preserve">OpenSpatialDelay is free software, licensed under the </w:t>
+      </w:r>
       <w:r>
         <w:rPr>
           <w:rFonts w:ascii="DM Sans" w:cs="DM Sans" w:eastAsia="DM Sans" w:hAnsi="DM Sans"/>
@@ -3690,7 +3685,7 @@
           <w:sz w:val="22"/>
           <w:szCs w:val="22"/>
         </w:rPr>
-        <w:t xml:space="preserve">1. GNU General Public License v3.0 (GPL-3.0) </w:t>
+        <w:t xml:space="preserve">GNU General Public License v3.0 (GPL-3.0)</w:t>
       </w:r>
       <w:r>
         <w:rPr>
@@ -3699,7 +3694,7 @@
           <w:sz w:val="22"/>
           <w:szCs w:val="22"/>
         </w:rPr>
-        <w:t xml:space="preserve">— for open-source use. Any derivative work must also be released under the GPL-3.0. The full license text is included in the LICENSE file distributed with the source code.</w:t>
+        <w:t xml:space="preserve">. Any derivative work must also be released under the GPL-3.0. The full license text is included in the LICENSE file distributed with the source code.</w:t>
       </w:r>
     </w:p>
     <w:p>
@@ -3709,43 +3704,13 @@
       <w:r>
         <w:rPr>
           <w:rFonts w:ascii="DM Sans" w:cs="DM Sans" w:eastAsia="DM Sans" w:hAnsi="DM Sans"/>
-          <w:b/>
-          <w:bCs/>
           <w:color w:val="1A1A2E"/>
           <w:sz w:val="22"/>
           <w:szCs w:val="22"/>
         </w:rPr>
-        <w:t xml:space="preserve">2. Commercial License </w:t>
-      </w:r>
-      <w:r>
-        <w:rPr>
-          <w:rFonts w:ascii="DM Sans" w:cs="DM Sans" w:eastAsia="DM Sans" w:hAnsi="DM Sans"/>
-          <w:color w:val="1A1A2E"/>
-          <w:sz w:val="22"/>
-          <w:szCs w:val="22"/>
-        </w:rPr>
-        <w:t xml:space="preserve">— for use in proprietary or closed-source products. Contact Spatial Media Lab for commercial licensing terms.</w:t>
-      </w:r>
-    </w:p>
-    <w:p>
-      <w:pPr>
-        <w:spacing w:after="160"/>
-      </w:pPr>
-    </w:p>
-    <w:p>
-      <w:pPr>
-        <w:spacing w:after="160" w:line="300"/>
-      </w:pPr>
-      <w:r>
-        <w:rPr>
-          <w:rFonts w:ascii="DM Sans" w:cs="DM Sans" w:eastAsia="DM Sans" w:hAnsi="DM Sans"/>
-          <w:color w:val="1A1A2E"/>
-          <w:sz w:val="22"/>
-          <w:szCs w:val="22"/>
-        </w:rPr>
         <w:t xml:space="preserve">Copyright (C) 2026 Spatial Media Lab (</w:t>
       </w:r>
-      <w:hyperlink w:history="1" r:id="rIdfmwbcmem3hcuknq-riw0-">
+      <w:hyperlink w:history="1" r:id="rId5777sgdjdcxxsgzcqxad6">
         <w:r>
           <w:rPr>
             <w:rFonts w:ascii="DM Sans" w:cs="DM Sans" w:eastAsia="DM Sans" w:hAnsi="DM Sans"/>

</xml_diff>